<commit_message>
Add desktop collapsible Filters/Tools, in-app guide link, and FAQ on shared-folder status conflicts
- Remove desktop override that forced Filters/Tools sections expanded, so they collapse like on mobile
- Add Quick Start Guide download link to the in-app help modal
- Add FAQ entry (deck + guide) explaining that existing place status wins over imports from shared folders
- Add QR code to closing slide and reframe Booking.com FAQ as a future affiliate opportunity
</commit_message>
<xml_diff>
--- a/Visual Materials/My projects/AI/Gemenai project/better version cloude/MapFolio-Quick-Start-Guide.docx
+++ b/Visual Materials/My projects/AI/Gemenai project/better version cloude/MapFolio-Quick-Start-Guide.docx
@@ -919,6 +919,22 @@
       </w:pPr>
       <w:r>
         <w:t xml:space="preserve">No. MapFolio doesn't book anything and has no connection to any travel or accommodation service. It's just a personal map and trip-planning tool — no accounts, no bookings, no external services.</w:t>
+      </w:r>
+    </w:p>
+    <w:p>
+      <w:pPr>
+        <w:pStyle w:val="Heading2"/>
+      </w:pPr>
+      <w:r>
+        <w:t xml:space="preserve">What if a shared folder has a place I've already visited?</w:t>
+      </w:r>
+    </w:p>
+    <w:p>
+      <w:pPr>
+        <w:spacing w:after="120"/>
+      </w:pPr>
+      <w:r>
+        <w:t xml:space="preserve">Your existing status always wins. If MapFolio recognizes the place as one you already have (same link or same name), the incoming copy is skipped — your status (e.g. "Loved It") stays as it is. Note that it also won't be added to the new shared folder in this case.</w:t>
       </w:r>
     </w:p>
     <w:p>

</xml_diff>